<commit_message>
Add master index spreadsheet and optional thumbnails (v0.2.0)
- manifest_to_index.py: aggregate all manifests into one .xlsx/.csv,
  one row per image (Folder/#/File/Category/Alt chars/Alt text/Long desc/Notes)
- manifest_to_docx.py --thumbs: thumbnail | description layout, EXIF-rotated,
  resolves plain images and rasterized PDF pages (--images-dir/--raster-dir)
- manifest_common.py: shared parser extracted from the docx generator
- pdf_to_pngs.sh: cross-platform rasterizer (poppler/ImageMagick/macOS PDFKit)
- docs, requirements, changelog; example master index

Co-Authored-By: Claude Opus 4.8 <noreply@anthropic.com>
</commit_message>
<xml_diff>
--- a/examples/sample-output.docx
+++ b/examples/sample-output.docx
@@ -221,7 +221,7 @@
     <w:p>
       <w:pPr>
         <w:spacing w:after="80"/>
-        <w:ind w:left="360"/>
+        <w:ind w:left="288"/>
       </w:pPr>
       <w:r>
         <w:t>Flat orthographic drawing of the library's west face. The two-story building has a symmetrical</w:t>
@@ -314,7 +314,7 @@
     <w:p>
       <w:pPr>
         <w:spacing w:after="80"/>
-        <w:ind w:left="360"/>
+        <w:ind w:left="288"/>
       </w:pPr>
       <w:r>
         <w:t>Overhead site plan with the library's footprint centered on the parcel. River Road runs along the</w:t>

</xml_diff>